<commit_message>
fix: harden engine timing and lifecycle behavior
</commit_message>
<xml_diff>
--- a/docs/PURE_PYTHON_GAME_ENGINE_ROADMAP.docx
+++ b/docs/PURE_PYTHON_GAME_ENGINE_ROADMAP.docx
@@ -260,7 +260,7 @@
         <w:pStyle w:val="Heading2"/>
       </w:pPr>
       <w:r>
-        <w:t>3. Correct contained core inconsistencies</w:t>
+        <w:t>3. Correct contained core inconsistencies — completed September 26, 2026</w:t>
       </w:r>
     </w:p>
     <w:p>
@@ -284,7 +284,7 @@
         <w:pStyle w:val="ListBullet"/>
       </w:pPr>
       <w:r>
-        <w:t>Choose and document the timing model: fixed timestep, variable timestep, or fixed updates with interpolated rendering.</w:t>
+        <w:t>Use and document a bounded variable timestep with delta smoothing and stall protection.</w:t>
       </w:r>
     </w:p>
     <w:p>

</xml_diff>

<commit_message>
docs: establish GameObject as primary architecture
</commit_message>
<xml_diff>
--- a/docs/PURE_PYTHON_GAME_ENGINE_ROADMAP.docx
+++ b/docs/PURE_PYTHON_GAME_ENGINE_ROADMAP.docx
@@ -324,7 +324,7 @@
         <w:pStyle w:val="Heading1"/>
       </w:pPr>
       <w:r>
-        <w:t>Milestone 2: Clarify the Engine Architecture</w:t>
+        <w:t>Milestone 2: Clarify the Engine Architecture — completed September 26, 2026</w:t>
       </w:r>
     </w:p>
     <w:p>
@@ -433,7 +433,7 @@
         <w:rPr>
           <w:b/>
         </w:rPr>
-        <w:t>Current recommendation: choose Option A. The existing GameObject model already works across several games, so it should be strengthened before considering a migration or hybrid abstraction.</w:t>
+        <w:t>Decision: Option A accepted. GameObject/components are the primary supported architecture; ECS remains an explicitly imported experimental subsystem.</w:t>
       </w:r>
     </w:p>
     <w:p>
@@ -670,7 +670,7 @@
         <w:pStyle w:val="ListBullet"/>
       </w:pPr>
       <w:r>
-        <w:t>Logging and ECS code exist but are not exposed through the main engine package API.</w:t>
+        <w:t>Logging is not exposed through the main engine package API; ECS is intentionally available only through its experimental subpackage.</w:t>
       </w:r>
     </w:p>
     <w:p>
@@ -686,7 +686,7 @@
         <w:pStyle w:val="ListBullet"/>
       </w:pPr>
       <w:r>
-        <w:t>The README contains claims that should be verified against the implementation, including fixed timestep, object pooling, and spatial partitioning.</w:t>
+        <w:t>The README claims about object pooling and spatial partitioning still need verification against the implementation.</w:t>
       </w:r>
     </w:p>
     <w:p>
@@ -726,7 +726,7 @@
         <w:pStyle w:val="ListNumber"/>
       </w:pPr>
       <w:r>
-        <w:t>A documented decision about GameObject versus ECS.</w:t>
+        <w:t>A documented decision about GameObject versus ECS. (Completed)</w:t>
       </w:r>
     </w:p>
     <w:p>

</xml_diff>

<commit_message>
refactor: migrate Breakout to collision components
</commit_message>
<xml_diff>
--- a/docs/PURE_PYTHON_GAME_ENGINE_ROADMAP.docx
+++ b/docs/PURE_PYTHON_GAME_ENGINE_ROADMAP.docx
@@ -449,7 +449,7 @@
         <w:pStyle w:val="Heading2"/>
       </w:pPr>
       <w:r>
-        <w:t>1. Reusable collision system</w:t>
+        <w:t>1. Reusable collision system — completed September 26, 2026</w:t>
       </w:r>
     </w:p>
     <w:p>
@@ -489,12 +489,12 @@
         <w:pStyle w:val="ListBullet"/>
       </w:pPr>
       <w:r>
-        <w:t>Optional spatial hashing for broad-phase detection after profiling.</w:t>
-      </w:r>
-    </w:p>
-    <w:p>
-      <w:r>
-        <w:t>A shared collision system should replace duplicated collision logic in individual games and make the engine substantially easier to use.</w:t>
+        <w:t>Optional spatial hashing for broad-phase detection remains deferred until profiling demonstrates a need.</w:t>
+      </w:r>
+    </w:p>
+    <w:p>
+      <w:r>
+        <w:t>The shared collision system is integrated with scenes, documented, and exercised by Breakout as its first complete reference game.</w:t>
       </w:r>
     </w:p>
     <w:p>
@@ -686,7 +686,7 @@
         <w:pStyle w:val="ListBullet"/>
       </w:pPr>
       <w:r>
-        <w:t>The README claims about object pooling and spatial partitioning still need verification against the implementation.</w:t>
+        <w:t/>
       </w:r>
     </w:p>
     <w:p>
@@ -734,7 +734,7 @@
         <w:pStyle w:val="ListNumber"/>
       </w:pPr>
       <w:r>
-        <w:t>Reusable collision system.</w:t>
+        <w:t>Reusable collision system. (Completed)</w:t>
       </w:r>
     </w:p>
     <w:p>

</xml_diff>

<commit_message>
docs: add asset demo and sprite-sheet example
</commit_message>
<xml_diff>
--- a/docs/PURE_PYTHON_GAME_ENGINE_ROADMAP.docx
+++ b/docs/PURE_PYTHON_GAME_ENGINE_ROADMAP.docx
@@ -502,7 +502,7 @@
         <w:pStyle w:val="Heading2"/>
       </w:pPr>
       <w:r>
-        <w:t>2. Asset and animation system</w:t>
+        <w:t>2. Asset and animation system — completed September 26, 2026</w:t>
       </w:r>
     </w:p>
     <w:p>
@@ -534,7 +534,7 @@
         <w:pStyle w:val="ListBullet"/>
       </w:pPr>
       <w:r>
-        <w:t>Consistent asset paths and graceful missing-asset behavior.</w:t>
+        <w:t>Consistent asset paths and graceful missing-asset behavior. The system now provides cached Tkinter images, lazy sprite-sheet extraction, reusable clips with independent playback, documentation, and a real PNG demo asset.</w:t>
       </w:r>
     </w:p>
     <w:p>
@@ -742,7 +742,7 @@
         <w:pStyle w:val="ListNumber"/>
       </w:pPr>
       <w:r>
-        <w:t>Asset and animation improvements.</w:t>
+        <w:t>Asset and animation improvements. (Completed)</w:t>
       </w:r>
     </w:p>
     <w:p>

</xml_diff>

<commit_message>
chore: add project metadata and fix license mismatch
Adds pyproject.toml with PEP 621 metadata (MIT license, Python 3.10+,
zero runtime dependencies beyond the standard library). Verified by
building and installing the package into a clean virtualenv and
confirming the engine package imports correctly from it.

Also fixes a real license mismatch: LICENSE contained the full GNU
AGPLv3 text while the README claimed MIT. LICENSE now contains the
actual MIT text to match.

Completes the two outstanding items from Milestone 1 (repository
cleanup): project metadata and a stable release tag.
</commit_message>
<xml_diff>
--- a/docs/PURE_PYTHON_GAME_ENGINE_ROADMAP.docx
+++ b/docs/PURE_PYTHON_GAME_ENGINE_ROADMAP.docx
@@ -260,7 +260,7 @@
       </w:pPr>
       <w:r>
         <w:rPr/>
-        <w:t>1. Repository cleanup</w:t>
+        <w:t>1. Repository cleanup — completed September 26, 2026</w:t>
       </w:r>
     </w:p>
     <w:p>
@@ -358,7 +358,20 @@
       </w:pPr>
       <w:r>
         <w:rPr/>
-        <w:t>2. Add headless automated tests</w:t>
+        <w:t>pyproject.toml declares the package metadata (MIT license, Python 3.10+, zero runtime dependencies) and was verified by building and installing it into a clean virtual environment. The LICENSE file previously contained the full GNU AGPLv3 text while the README claimed MIT; LICENSE now contains the actual MIT text to match. Tagged v0.1.0.</w:t>
+      </w:r>
+    </w:p>
+    <w:p>
+      <w:pPr>
+        <w:pStyle w:val="PreformattedText"/>
+        <w:bidi w:val="0"/>
+        <w:spacing w:before="0" w:after="0"/>
+        <w:jc w:val="left"/>
+        <w:rPr/>
+      </w:pPr>
+      <w:r>
+        <w:rPr/>
+        <w:t>2. Add headless automated tests — completed September 26, 2026</w:t>
       </w:r>
     </w:p>
     <w:p>
@@ -520,6 +533,19 @@
       </w:pPr>
       <w:r>
         <w:rPr/>
+        <w:t>174 tests now cover these areas across tests/, run with `python -m unittest discover -s tests`.</w:t>
+      </w:r>
+    </w:p>
+    <w:p>
+      <w:pPr>
+        <w:pStyle w:val="PreformattedText"/>
+        <w:bidi w:val="0"/>
+        <w:spacing w:before="0" w:after="0"/>
+        <w:jc w:val="left"/>
+        <w:rPr/>
+      </w:pPr>
+      <w:r>
+        <w:rPr/>
         <w:t>Graphical screenshot tests are intentionally deferred. The first tests should be quick, headless, portable, and useful during every engine change.</w:t>
       </w:r>
     </w:p>
@@ -1438,7 +1464,7 @@
       </w:r>
       <w:r>
         <w:rPr/>
-        <w:t>1. Repository cleanup and stable release tag.</w:t>
+        <w:t>1. Repository cleanup and stable release tag. (Completed)</w:t>
       </w:r>
     </w:p>
     <w:p>
@@ -1455,7 +1481,7 @@
       </w:r>
       <w:r>
         <w:rPr/>
-        <w:t>2. Automated tests for non-graphical systems.</w:t>
+        <w:t>2. Automated tests for non-graphical systems. (Completed)</w:t>
       </w:r>
     </w:p>
     <w:p>
@@ -1472,7 +1498,7 @@
       </w:r>
       <w:r>
         <w:rPr/>
-        <w:t>3. Timing and lifecycle corrections.</w:t>
+        <w:t>3. Timing and lifecycle corrections. (Completed)</w:t>
       </w:r>
     </w:p>
     <w:p>

</xml_diff>